<commit_message>
refactor: reordena roadmap — valor antes de monetizacao
Inverte a sequencia de execucao: fundacao > features diferenciadoras >
retencao > monetizacao (Stripe por ultimo, quando o produto ja entrega
valor percebido). Itens ja concluidos marcados como feitos no roadmap.
Atualiza README com fases e regra de branch por atividade.

Co-Authored-By: Claude Sonnet 4.6 <noreply@anthropic.com>
</commit_message>
<xml_diff>
--- a/ROADMAP.docx
+++ b/ROADMAP.docx
@@ -21,10 +21,25 @@
       </w:pPr>
       <w:r>
         <w:rPr>
-          <w:color w:val="888888"/>
+          <w:color w:val="555555"/>
           <w:sz w:val="18"/>
         </w:rPr>
-        <w:t>Levantamento: 22/05/2026  |  Disponibilidade: 15h/dia  |  Total estimado: ~96h = 6,5 dias</w:t>
+        <w:t>Levantamento: 22/05/2026  |  Disponibilidade: 15h/dia  |  Total restante: ~93h = 6,2 dias</w:t>
+        <w:br/>
+        <w:t>Estrategia: construir valor primeiro, monetizar por ultimo.</w:t>
+      </w:r>
+    </w:p>
+    <w:p>
+      <w:pPr>
+        <w:jc w:val="center"/>
+      </w:pPr>
+      <w:r>
+        <w:rPr>
+          <w:i/>
+          <w:color w:val="333399"/>
+          <w:sz w:val="17"/>
+        </w:rPr>
+        <w:t>Regra: cada item inicia em branch dedicada. Ao termino: atualizar README.md &gt; merge na main &gt; push para o GitHub.</w:t>
       </w:r>
     </w:p>
     <w:p/>
@@ -34,10 +49,10 @@
       </w:pPr>
       <w:r>
         <w:rPr>
-          <w:color w:val="C0392B"/>
-          <w:sz w:val="26"/>
+          <w:color w:val="2C3E50"/>
+          <w:sz w:val="24"/>
         </w:rPr>
-        <w:t>TIER 1 - Critico  (bugs + divida de produto)  |  30h = 2 dias</w:t>
+        <w:t>FASE 1 - Fundacao  (bugs visiveis + qualidade de codigo)  |  10h restantes = 0,7 dias</w:t>
       </w:r>
     </w:p>
     <w:p>
@@ -46,7 +61,7 @@
           <w:i/>
           <w:sz w:val="16"/>
         </w:rPr>
-        <w:t>Prioridade maxima. Bloqueiam monetizacao ou causam erros visiveis ao usuario.</w:t>
+        <w:t>Resolver o que quebra hoje e criar a base que sustenta tudo que vem depois.</w:t>
       </w:r>
     </w:p>
     <w:tbl>
@@ -56,15 +71,16 @@
         <w:tblLook w:firstColumn="1" w:firstRow="1" w:lastColumn="0" w:lastRow="0" w:noHBand="0" w:noVBand="1" w:val="04A0"/>
       </w:tblPr>
       <w:tblGrid>
-        <w:gridCol w:w="2340"/>
-        <w:gridCol w:w="2340"/>
-        <w:gridCol w:w="2340"/>
-        <w:gridCol w:w="2340"/>
+        <w:gridCol w:w="1872"/>
+        <w:gridCol w:w="1872"/>
+        <w:gridCol w:w="1872"/>
+        <w:gridCol w:w="1872"/>
+        <w:gridCol w:w="1872"/>
       </w:tblGrid>
       <w:tr>
         <w:tc>
           <w:tcPr>
-            <w:tcW w:type="dxa" w:w="360"/>
+            <w:tcW w:type="dxa" w:w="317"/>
             <w:shd w:val="clear" w:color="auto" w:fill="1a1a2e"/>
           </w:tcPr>
           <w:p>
@@ -83,7 +99,7 @@
         </w:tc>
         <w:tc>
           <w:tcPr>
-            <w:tcW w:type="dxa" w:w="4608"/>
+            <w:tcW w:type="dxa" w:w="4176"/>
             <w:shd w:val="clear" w:color="auto" w:fill="1a1a2e"/>
           </w:tcPr>
           <w:p>
@@ -102,7 +118,7 @@
         </w:tc>
         <w:tc>
           <w:tcPr>
-            <w:tcW w:type="dxa" w:w="864"/>
+            <w:tcW w:type="dxa" w:w="792"/>
             <w:shd w:val="clear" w:color="auto" w:fill="1a1a2e"/>
           </w:tcPr>
           <w:p>
@@ -121,7 +137,26 @@
         </w:tc>
         <w:tc>
           <w:tcPr>
-            <w:tcW w:type="dxa" w:w="4176"/>
+            <w:tcW w:type="dxa" w:w="936"/>
+            <w:shd w:val="clear" w:color="auto" w:fill="1a1a2e"/>
+          </w:tcPr>
+          <w:p>
+            <w:pPr>
+              <w:jc w:val="center"/>
+            </w:pPr>
+            <w:r>
+              <w:rPr>
+                <w:b/>
+                <w:color w:val="FFFFFF"/>
+                <w:sz w:val="18"/>
+              </w:rPr>
+              <w:t>Status</w:t>
+            </w:r>
+          </w:p>
+        </w:tc>
+        <w:tc>
+          <w:tcPr>
+            <w:tcW w:type="dxa" w:w="3744"/>
             <w:shd w:val="clear" w:color="auto" w:fill="1a1a2e"/>
           </w:tcPr>
           <w:p>
@@ -142,7 +177,7 @@
       <w:tr>
         <w:tc>
           <w:tcPr>
-            <w:tcW w:type="dxa" w:w="360"/>
+            <w:tcW w:type="dxa" w:w="317"/>
             <w:shd w:val="clear" w:color="auto" w:fill="f0f4ff"/>
           </w:tcPr>
           <w:p>
@@ -156,7 +191,7 @@
         </w:tc>
         <w:tc>
           <w:tcPr>
-            <w:tcW w:type="dxa" w:w="4608"/>
+            <w:tcW w:type="dxa" w:w="4176"/>
             <w:shd w:val="clear" w:color="auto" w:fill="f0f4ff"/>
           </w:tcPr>
           <w:p>
@@ -170,7 +205,7 @@
         </w:tc>
         <w:tc>
           <w:tcPr>
-            <w:tcW w:type="dxa" w:w="864"/>
+            <w:tcW w:type="dxa" w:w="792"/>
             <w:shd w:val="clear" w:color="auto" w:fill="f0f4ff"/>
           </w:tcPr>
           <w:p>
@@ -184,7 +219,21 @@
         </w:tc>
         <w:tc>
           <w:tcPr>
-            <w:tcW w:type="dxa" w:w="4176"/>
+            <w:tcW w:type="dxa" w:w="936"/>
+            <w:shd w:val="clear" w:color="auto" w:fill="f0f4ff"/>
+          </w:tcPr>
+          <w:p>
+            <w:r>
+              <w:rPr>
+                <w:sz w:val="16"/>
+              </w:rPr>
+              <w:t>pendente</w:t>
+            </w:r>
+          </w:p>
+        </w:tc>
+        <w:tc>
+          <w:tcPr>
+            <w:tcW w:type="dxa" w:w="3744"/>
             <w:shd w:val="clear" w:color="auto" w:fill="f0f4ff"/>
           </w:tcPr>
           <w:p>
@@ -200,7 +249,7 @@
       <w:tr>
         <w:tc>
           <w:tcPr>
-            <w:tcW w:type="dxa" w:w="360"/>
+            <w:tcW w:type="dxa" w:w="317"/>
           </w:tcPr>
           <w:p>
             <w:r>
@@ -213,7 +262,7 @@
         </w:tc>
         <w:tc>
           <w:tcPr>
-            <w:tcW w:type="dxa" w:w="4608"/>
+            <w:tcW w:type="dxa" w:w="4176"/>
           </w:tcPr>
           <w:p>
             <w:r>
@@ -226,7 +275,7 @@
         </w:tc>
         <w:tc>
           <w:tcPr>
-            <w:tcW w:type="dxa" w:w="864"/>
+            <w:tcW w:type="dxa" w:w="792"/>
           </w:tcPr>
           <w:p>
             <w:r>
@@ -239,7 +288,20 @@
         </w:tc>
         <w:tc>
           <w:tcPr>
-            <w:tcW w:type="dxa" w:w="4176"/>
+            <w:tcW w:type="dxa" w:w="936"/>
+          </w:tcPr>
+          <w:p>
+            <w:r>
+              <w:rPr>
+                <w:sz w:val="16"/>
+              </w:rPr>
+              <w:t>pendente</w:t>
+            </w:r>
+          </w:p>
+        </w:tc>
+        <w:tc>
+          <w:tcPr>
+            <w:tcW w:type="dxa" w:w="3744"/>
           </w:tcPr>
           <w:p>
             <w:r>
@@ -254,7 +316,7 @@
       <w:tr>
         <w:tc>
           <w:tcPr>
-            <w:tcW w:type="dxa" w:w="360"/>
+            <w:tcW w:type="dxa" w:w="317"/>
             <w:shd w:val="clear" w:color="auto" w:fill="f0f4ff"/>
           </w:tcPr>
           <w:p>
@@ -268,7 +330,7 @@
         </w:tc>
         <w:tc>
           <w:tcPr>
-            <w:tcW w:type="dxa" w:w="4608"/>
+            <w:tcW w:type="dxa" w:w="4176"/>
             <w:shd w:val="clear" w:color="auto" w:fill="f0f4ff"/>
           </w:tcPr>
           <w:p>
@@ -276,69 +338,14 @@
               <w:rPr>
                 <w:sz w:val="16"/>
               </w:rPr>
-              <w:t>Integracao Stripe real (substituir ativarPremiumDemo())</w:t>
+              <w:t>Testes automatizados basicos (tests.js)</w:t>
             </w:r>
           </w:p>
         </w:tc>
         <w:tc>
           <w:tcPr>
-            <w:tcW w:type="dxa" w:w="864"/>
+            <w:tcW w:type="dxa" w:w="792"/>
             <w:shd w:val="clear" w:color="auto" w:fill="f0f4ff"/>
-          </w:tcPr>
-          <w:p>
-            <w:r>
-              <w:rPr>
-                <w:sz w:val="16"/>
-              </w:rPr>
-              <w:t>16h</w:t>
-            </w:r>
-          </w:p>
-        </w:tc>
-        <w:tc>
-          <w:tcPr>
-            <w:tcW w:type="dxa" w:w="4176"/>
-            <w:shd w:val="clear" w:color="auto" w:fill="f0f4ff"/>
-          </w:tcPr>
-          <w:p>
-            <w:r>
-              <w:rPr>
-                <w:sz w:val="15"/>
-              </w:rPr>
-              <w:t>Checkout session, webhook, atualizacao de plano no Supabase</w:t>
-            </w:r>
-          </w:p>
-        </w:tc>
-      </w:tr>
-      <w:tr>
-        <w:tc>
-          <w:tcPr>
-            <w:tcW w:type="dxa" w:w="360"/>
-          </w:tcPr>
-          <w:p>
-            <w:r>
-              <w:rPr>
-                <w:sz w:val="16"/>
-              </w:rPr>
-              <w:t>4</w:t>
-            </w:r>
-          </w:p>
-        </w:tc>
-        <w:tc>
-          <w:tcPr>
-            <w:tcW w:type="dxa" w:w="4608"/>
-          </w:tcPr>
-          <w:p>
-            <w:r>
-              <w:rPr>
-                <w:sz w:val="16"/>
-              </w:rPr>
-              <w:t>Proxy API via Supabase Edge Function</w:t>
-            </w:r>
-          </w:p>
-        </w:tc>
-        <w:tc>
-          <w:tcPr>
-            <w:tcW w:type="dxa" w:w="864"/>
           </w:tcPr>
           <w:p>
             <w:r>
@@ -351,14 +358,29 @@
         </w:tc>
         <w:tc>
           <w:tcPr>
-            <w:tcW w:type="dxa" w:w="4176"/>
+            <w:tcW w:type="dxa" w:w="936"/>
+            <w:shd w:val="clear" w:color="auto" w:fill="f0f4ff"/>
+          </w:tcPr>
+          <w:p>
+            <w:r>
+              <w:rPr>
+                <w:sz w:val="16"/>
+              </w:rPr>
+              <w:t>pendente</w:t>
+            </w:r>
+          </w:p>
+        </w:tc>
+        <w:tc>
+          <w:tcPr>
+            <w:tcW w:type="dxa" w:w="3744"/>
+            <w:shd w:val="clear" w:color="auto" w:fill="f0f4ff"/>
           </w:tcPr>
           <w:p>
             <w:r>
               <w:rPr>
                 <w:sz w:val="15"/>
               </w:rPr>
-              <w:t>Plataforma chama Anthropic com chave propria; controle por plano; fim da dependencia da chave do usuario</w:t>
+              <w:t>Smoke tests para funcoes criticas; 4.300+ linhas sem teste e risco alto</w:t>
             </w:r>
           </w:p>
         </w:tc>
@@ -366,12 +388,96 @@
       <w:tr>
         <w:tc>
           <w:tcPr>
-            <w:tcW w:type="dxa" w:w="360"/>
-            <w:shd w:val="clear" w:color="auto" w:fill="f0f4ff"/>
+            <w:tcW w:type="dxa" w:w="317"/>
+            <w:shd w:val="clear" w:color="auto" w:fill="f5f5f5"/>
           </w:tcPr>
           <w:p>
             <w:r>
               <w:rPr>
+                <w:i/>
+                <w:color w:val="AAAAAA"/>
+                <w:sz w:val="16"/>
+              </w:rPr>
+              <w:t>4</w:t>
+            </w:r>
+          </w:p>
+        </w:tc>
+        <w:tc>
+          <w:tcPr>
+            <w:tcW w:type="dxa" w:w="4176"/>
+            <w:shd w:val="clear" w:color="auto" w:fill="f5f5f5"/>
+          </w:tcPr>
+          <w:p>
+            <w:r>
+              <w:rPr>
+                <w:i/>
+                <w:color w:val="AAAAAA"/>
+                <w:sz w:val="16"/>
+              </w:rPr>
+              <w:t>Otimizar max_tokens por tipo de chamada a API</w:t>
+            </w:r>
+          </w:p>
+        </w:tc>
+        <w:tc>
+          <w:tcPr>
+            <w:tcW w:type="dxa" w:w="792"/>
+            <w:shd w:val="clear" w:color="auto" w:fill="f5f5f5"/>
+          </w:tcPr>
+          <w:p>
+            <w:r>
+              <w:rPr>
+                <w:i/>
+                <w:color w:val="AAAAAA"/>
+                <w:sz w:val="16"/>
+              </w:rPr>
+              <w:t>2h</w:t>
+            </w:r>
+          </w:p>
+        </w:tc>
+        <w:tc>
+          <w:tcPr>
+            <w:tcW w:type="dxa" w:w="936"/>
+            <w:shd w:val="clear" w:color="auto" w:fill="f5f5f5"/>
+          </w:tcPr>
+          <w:p>
+            <w:r>
+              <w:rPr>
+                <w:i/>
+                <w:color w:val="AAAAAA"/>
+                <w:sz w:val="16"/>
+              </w:rPr>
+              <w:t>feito</w:t>
+            </w:r>
+          </w:p>
+        </w:tc>
+        <w:tc>
+          <w:tcPr>
+            <w:tcW w:type="dxa" w:w="3744"/>
+            <w:shd w:val="clear" w:color="auto" w:fill="f5f5f5"/>
+          </w:tcPr>
+          <w:p>
+            <w:r>
+              <w:rPr>
+                <w:i/>
+                <w:color w:val="AAAAAA"/>
+                <w:sz w:val="15"/>
+              </w:rPr>
+              <w:t>callClaude() agora aceita maxTokens por feature</w:t>
+            </w:r>
+          </w:p>
+        </w:tc>
+      </w:tr>
+      <w:tr>
+        <w:tc>
+          <w:tcPr>
+            <w:tcW w:type="dxa" w:w="317"/>
+            <w:shd w:val="clear" w:color="auto" w:fill="f5f5f5"/>
+          </w:tcPr>
+          <w:p>
+            <w:r>
+              <w:rPr>
+                <w:i/>
+                <w:color w:val="AAAAAA"/>
                 <w:sz w:val="16"/>
               </w:rPr>
               <w:t>5</w:t>
@@ -380,43 +486,65 @@
         </w:tc>
         <w:tc>
           <w:tcPr>
-            <w:tcW w:type="dxa" w:w="4608"/>
-            <w:shd w:val="clear" w:color="auto" w:fill="f0f4ff"/>
+            <w:tcW w:type="dxa" w:w="4176"/>
+            <w:shd w:val="clear" w:color="auto" w:fill="f5f5f5"/>
           </w:tcPr>
           <w:p>
             <w:r>
               <w:rPr>
+                <w:i/>
+                <w:color w:val="AAAAAA"/>
                 <w:sz w:val="16"/>
               </w:rPr>
-              <w:t>Rate limiting real no backend (Supabase)</w:t>
+              <w:t>Atualizar README.md</w:t>
             </w:r>
           </w:p>
         </w:tc>
         <w:tc>
           <w:tcPr>
-            <w:tcW w:type="dxa" w:w="864"/>
-            <w:shd w:val="clear" w:color="auto" w:fill="f0f4ff"/>
+            <w:tcW w:type="dxa" w:w="792"/>
+            <w:shd w:val="clear" w:color="auto" w:fill="f5f5f5"/>
           </w:tcPr>
           <w:p>
             <w:r>
               <w:rPr>
+                <w:i/>
+                <w:color w:val="AAAAAA"/>
                 <w:sz w:val="16"/>
               </w:rPr>
-              <w:t>4h</w:t>
+              <w:t>1h</w:t>
             </w:r>
           </w:p>
         </w:tc>
         <w:tc>
           <w:tcPr>
-            <w:tcW w:type="dxa" w:w="4176"/>
-            <w:shd w:val="clear" w:color="auto" w:fill="f0f4ff"/>
+            <w:tcW w:type="dxa" w:w="936"/>
+            <w:shd w:val="clear" w:color="auto" w:fill="f5f5f5"/>
           </w:tcPr>
           <w:p>
             <w:r>
               <w:rPr>
+                <w:i/>
+                <w:color w:val="AAAAAA"/>
+                <w:sz w:val="16"/>
+              </w:rPr>
+              <w:t>feito</w:t>
+            </w:r>
+          </w:p>
+        </w:tc>
+        <w:tc>
+          <w:tcPr>
+            <w:tcW w:type="dxa" w:w="3744"/>
+            <w:shd w:val="clear" w:color="auto" w:fill="f5f5f5"/>
+          </w:tcPr>
+          <w:p>
+            <w:r>
+              <w:rPr>
+                <w:i/>
+                <w:color w:val="AAAAAA"/>
                 <w:sz w:val="15"/>
               </w:rPr>
-              <w:t>Contador de geracoes via RLS/trigger - nao so frontend; impede burla via console</w:t>
+              <w:t>README reflete v1.4: SM-2, gamificacao, freemium, multiplos programas</w:t>
             </w:r>
           </w:p>
         </w:tc>
@@ -429,10 +557,10 @@
       </w:pPr>
       <w:r>
         <w:rPr>
-          <w:color w:val="E67E22"/>
-          <w:sz w:val="26"/>
+          <w:color w:val="276E48"/>
+          <w:sz w:val="24"/>
         </w:rPr>
-        <w:t>TIER 2 - Roadmap pendente  |  34h = 2,3 dias</w:t>
+        <w:t>FASE 2 - Features diferenciadoras  |  21h = 1,4 dias</w:t>
       </w:r>
     </w:p>
     <w:p>
@@ -441,7 +569,7 @@
           <w:i/>
           <w:sz w:val="16"/>
         </w:rPr>
-        <w:t>Features prometidas ou planejadas que aumentam retencao e percepcao de valor.</w:t>
+        <w:t>Aumentam engajamento e criam o valor percebido que justificara a cobranca futura.</w:t>
       </w:r>
     </w:p>
     <w:tbl>
@@ -451,15 +579,16 @@
         <w:tblLook w:firstColumn="1" w:firstRow="1" w:lastColumn="0" w:lastRow="0" w:noHBand="0" w:noVBand="1" w:val="04A0"/>
       </w:tblPr>
       <w:tblGrid>
-        <w:gridCol w:w="2340"/>
-        <w:gridCol w:w="2340"/>
-        <w:gridCol w:w="2340"/>
-        <w:gridCol w:w="2340"/>
+        <w:gridCol w:w="1872"/>
+        <w:gridCol w:w="1872"/>
+        <w:gridCol w:w="1872"/>
+        <w:gridCol w:w="1872"/>
+        <w:gridCol w:w="1872"/>
       </w:tblGrid>
       <w:tr>
         <w:tc>
           <w:tcPr>
-            <w:tcW w:type="dxa" w:w="360"/>
+            <w:tcW w:type="dxa" w:w="317"/>
             <w:shd w:val="clear" w:color="auto" w:fill="1a1a2e"/>
           </w:tcPr>
           <w:p>
@@ -478,7 +607,7 @@
         </w:tc>
         <w:tc>
           <w:tcPr>
-            <w:tcW w:type="dxa" w:w="4608"/>
+            <w:tcW w:type="dxa" w:w="4176"/>
             <w:shd w:val="clear" w:color="auto" w:fill="1a1a2e"/>
           </w:tcPr>
           <w:p>
@@ -497,7 +626,7 @@
         </w:tc>
         <w:tc>
           <w:tcPr>
-            <w:tcW w:type="dxa" w:w="864"/>
+            <w:tcW w:type="dxa" w:w="792"/>
             <w:shd w:val="clear" w:color="auto" w:fill="1a1a2e"/>
           </w:tcPr>
           <w:p>
@@ -516,7 +645,26 @@
         </w:tc>
         <w:tc>
           <w:tcPr>
-            <w:tcW w:type="dxa" w:w="4176"/>
+            <w:tcW w:type="dxa" w:w="936"/>
+            <w:shd w:val="clear" w:color="auto" w:fill="1a1a2e"/>
+          </w:tcPr>
+          <w:p>
+            <w:pPr>
+              <w:jc w:val="center"/>
+            </w:pPr>
+            <w:r>
+              <w:rPr>
+                <w:b/>
+                <w:color w:val="FFFFFF"/>
+                <w:sz w:val="18"/>
+              </w:rPr>
+              <w:t>Status</w:t>
+            </w:r>
+          </w:p>
+        </w:tc>
+        <w:tc>
+          <w:tcPr>
+            <w:tcW w:type="dxa" w:w="3744"/>
             <w:shd w:val="clear" w:color="auto" w:fill="1a1a2e"/>
           </w:tcPr>
           <w:p>
@@ -537,7 +685,7 @@
       <w:tr>
         <w:tc>
           <w:tcPr>
-            <w:tcW w:type="dxa" w:w="360"/>
+            <w:tcW w:type="dxa" w:w="317"/>
             <w:shd w:val="clear" w:color="auto" w:fill="f0f4ff"/>
           </w:tcPr>
           <w:p>
@@ -551,7 +699,7 @@
         </w:tc>
         <w:tc>
           <w:tcPr>
-            <w:tcW w:type="dxa" w:w="4608"/>
+            <w:tcW w:type="dxa" w:w="4176"/>
             <w:shd w:val="clear" w:color="auto" w:fill="f0f4ff"/>
           </w:tcPr>
           <w:p>
@@ -559,14 +707,83 @@
               <w:rPr>
                 <w:sz w:val="16"/>
               </w:rPr>
-              <w:t>PWA: manifest.json + Service Worker offline</w:t>
+              <w:t>Diagnostico de lacunas de conhecimento</w:t>
             </w:r>
           </w:p>
         </w:tc>
         <w:tc>
           <w:tcPr>
-            <w:tcW w:type="dxa" w:w="864"/>
+            <w:tcW w:type="dxa" w:w="792"/>
             <w:shd w:val="clear" w:color="auto" w:fill="f0f4ff"/>
+          </w:tcPr>
+          <w:p>
+            <w:r>
+              <w:rPr>
+                <w:sz w:val="16"/>
+              </w:rPr>
+              <w:t>8h</w:t>
+            </w:r>
+          </w:p>
+        </w:tc>
+        <w:tc>
+          <w:tcPr>
+            <w:tcW w:type="dxa" w:w="936"/>
+            <w:shd w:val="clear" w:color="auto" w:fill="f0f4ff"/>
+          </w:tcPr>
+          <w:p>
+            <w:r>
+              <w:rPr>
+                <w:sz w:val="16"/>
+              </w:rPr>
+              <w:t>pendente</w:t>
+            </w:r>
+          </w:p>
+        </w:tc>
+        <w:tc>
+          <w:tcPr>
+            <w:tcW w:type="dxa" w:w="3744"/>
+            <w:shd w:val="clear" w:color="auto" w:fill="f0f4ff"/>
+          </w:tcPr>
+          <w:p>
+            <w:r>
+              <w:rPr>
+                <w:sz w:val="15"/>
+              </w:rPr>
+              <w:t>Identifica topicos com mais erros no simulado &gt; sugere historinha ou revisao SM-2</w:t>
+            </w:r>
+          </w:p>
+        </w:tc>
+      </w:tr>
+      <w:tr>
+        <w:tc>
+          <w:tcPr>
+            <w:tcW w:type="dxa" w:w="317"/>
+          </w:tcPr>
+          <w:p>
+            <w:r>
+              <w:rPr>
+                <w:sz w:val="16"/>
+              </w:rPr>
+              <w:t>7</w:t>
+            </w:r>
+          </w:p>
+        </w:tc>
+        <w:tc>
+          <w:tcPr>
+            <w:tcW w:type="dxa" w:w="4176"/>
+          </w:tcPr>
+          <w:p>
+            <w:r>
+              <w:rPr>
+                <w:sz w:val="16"/>
+              </w:rPr>
+              <w:t>Compartilhamento de programas de estudo</w:t>
+            </w:r>
+          </w:p>
+        </w:tc>
+        <w:tc>
+          <w:tcPr>
+            <w:tcW w:type="dxa" w:w="792"/>
           </w:tcPr>
           <w:p>
             <w:r>
@@ -579,15 +796,27 @@
         </w:tc>
         <w:tc>
           <w:tcPr>
-            <w:tcW w:type="dxa" w:w="4176"/>
-            <w:shd w:val="clear" w:color="auto" w:fill="f0f4ff"/>
+            <w:tcW w:type="dxa" w:w="936"/>
+          </w:tcPr>
+          <w:p>
+            <w:r>
+              <w:rPr>
+                <w:sz w:val="16"/>
+              </w:rPr>
+              <w:t>pendente</w:t>
+            </w:r>
+          </w:p>
+        </w:tc>
+        <w:tc>
+          <w:tcPr>
+            <w:tcW w:type="dxa" w:w="3744"/>
           </w:tcPr>
           <w:p>
             <w:r>
               <w:rPr>
                 <w:sz w:val="15"/>
               </w:rPr>
-              <w:t>Instalacao na tela inicial do celular; funciona offline real</w:t>
+              <w:t>Export/import de programa com materias e topicos (JSON)</w:t>
             </w:r>
           </w:p>
         </w:tc>
@@ -595,61 +824,7 @@
       <w:tr>
         <w:tc>
           <w:tcPr>
-            <w:tcW w:type="dxa" w:w="360"/>
-          </w:tcPr>
-          <w:p>
-            <w:r>
-              <w:rPr>
-                <w:sz w:val="16"/>
-              </w:rPr>
-              <w:t>7</w:t>
-            </w:r>
-          </w:p>
-        </w:tc>
-        <w:tc>
-          <w:tcPr>
-            <w:tcW w:type="dxa" w:w="4608"/>
-          </w:tcPr>
-          <w:p>
-            <w:r>
-              <w:rPr>
-                <w:sz w:val="16"/>
-              </w:rPr>
-              <w:t>Push notifications para revisao SM-2</w:t>
-            </w:r>
-          </w:p>
-        </w:tc>
-        <w:tc>
-          <w:tcPr>
-            <w:tcW w:type="dxa" w:w="864"/>
-          </w:tcPr>
-          <w:p>
-            <w:r>
-              <w:rPr>
-                <w:sz w:val="16"/>
-              </w:rPr>
-              <w:t>8h</w:t>
-            </w:r>
-          </w:p>
-        </w:tc>
-        <w:tc>
-          <w:tcPr>
-            <w:tcW w:type="dxa" w:w="4176"/>
-          </w:tcPr>
-          <w:p>
-            <w:r>
-              <w:rPr>
-                <w:sz w:val="15"/>
-              </w:rPr>
-              <w:t>Lembrete no dia correto de revisar; SM-2 perde metade do valor sem alerta</w:t>
-            </w:r>
-          </w:p>
-        </w:tc>
-      </w:tr>
-      <w:tr>
-        <w:tc>
-          <w:tcPr>
-            <w:tcW w:type="dxa" w:w="360"/>
+            <w:tcW w:type="dxa" w:w="317"/>
             <w:shd w:val="clear" w:color="auto" w:fill="f0f4ff"/>
           </w:tcPr>
           <w:p>
@@ -663,7 +838,7 @@
         </w:tc>
         <w:tc>
           <w:tcPr>
-            <w:tcW w:type="dxa" w:w="4608"/>
+            <w:tcW w:type="dxa" w:w="4176"/>
             <w:shd w:val="clear" w:color="auto" w:fill="f0f4ff"/>
           </w:tcPr>
           <w:p>
@@ -671,13 +846,13 @@
               <w:rPr>
                 <w:sz w:val="16"/>
               </w:rPr>
-              <w:t>Onboarding wizard para novos usuarios</w:t>
+              <w:t>Estimativa de prontidao para a prova</w:t>
             </w:r>
           </w:p>
         </w:tc>
         <w:tc>
           <w:tcPr>
-            <w:tcW w:type="dxa" w:w="864"/>
+            <w:tcW w:type="dxa" w:w="792"/>
             <w:shd w:val="clear" w:color="auto" w:fill="f0f4ff"/>
           </w:tcPr>
           <w:p>
@@ -685,13 +860,27 @@
               <w:rPr>
                 <w:sz w:val="16"/>
               </w:rPr>
-              <w:t>6h</w:t>
+              <w:t>4h</w:t>
             </w:r>
           </w:p>
         </w:tc>
         <w:tc>
           <w:tcPr>
-            <w:tcW w:type="dxa" w:w="4176"/>
+            <w:tcW w:type="dxa" w:w="936"/>
+            <w:shd w:val="clear" w:color="auto" w:fill="f0f4ff"/>
+          </w:tcPr>
+          <w:p>
+            <w:r>
+              <w:rPr>
+                <w:sz w:val="16"/>
+              </w:rPr>
+              <w:t>pendente</w:t>
+            </w:r>
+          </w:p>
+        </w:tc>
+        <w:tc>
+          <w:tcPr>
+            <w:tcW w:type="dxa" w:w="3744"/>
             <w:shd w:val="clear" w:color="auto" w:fill="f0f4ff"/>
           </w:tcPr>
           <w:p>
@@ -699,7 +888,7 @@
               <w:rPr>
                 <w:sz w:val="15"/>
               </w:rPr>
-              <w:t>Wizard 3 passos: criar programa &gt; materia &gt; primeira historinha</w:t>
+              <w:t>"Com seu ritmo atual, cobrira X% do conteudo ate a data da prova"</w:t>
             </w:r>
           </w:p>
         </w:tc>
@@ -707,7 +896,7 @@
       <w:tr>
         <w:tc>
           <w:tcPr>
-            <w:tcW w:type="dxa" w:w="360"/>
+            <w:tcW w:type="dxa" w:w="317"/>
           </w:tcPr>
           <w:p>
             <w:r>
@@ -720,152 +909,53 @@
         </w:tc>
         <w:tc>
           <w:tcPr>
-            <w:tcW w:type="dxa" w:w="4608"/>
+            <w:tcW w:type="dxa" w:w="4176"/>
           </w:tcPr>
           <w:p>
             <w:r>
               <w:rPr>
                 <w:sz w:val="16"/>
               </w:rPr>
-              <w:t>Historico de notas das redacoes com grafico</w:t>
+              <w:t>Suporte a LaTeX/MathJax nas respostas</w:t>
             </w:r>
           </w:p>
         </w:tc>
         <w:tc>
           <w:tcPr>
-            <w:tcW w:type="dxa" w:w="864"/>
+            <w:tcW w:type="dxa" w:w="792"/>
           </w:tcPr>
           <w:p>
             <w:r>
               <w:rPr>
                 <w:sz w:val="16"/>
               </w:rPr>
-              <w:t>4h</w:t>
+              <w:t>3h</w:t>
             </w:r>
           </w:p>
         </w:tc>
         <w:tc>
           <w:tcPr>
-            <w:tcW w:type="dxa" w:w="4176"/>
+            <w:tcW w:type="dxa" w:w="936"/>
+          </w:tcPr>
+          <w:p>
+            <w:r>
+              <w:rPr>
+                <w:sz w:val="16"/>
+              </w:rPr>
+              <w:t>pendente</w:t>
+            </w:r>
+          </w:p>
+        </w:tc>
+        <w:tc>
+          <w:tcPr>
+            <w:tcW w:type="dxa" w:w="3744"/>
           </w:tcPr>
           <w:p>
             <w:r>
               <w:rPr>
                 <w:sz w:val="15"/>
               </w:rPr>
-              <w:t>Chart.js ja disponivel; salvar nota por redacao no Supabase</w:t>
-            </w:r>
-          </w:p>
-        </w:tc>
-      </w:tr>
-      <w:tr>
-        <w:tc>
-          <w:tcPr>
-            <w:tcW w:type="dxa" w:w="360"/>
-            <w:shd w:val="clear" w:color="auto" w:fill="f0f4ff"/>
-          </w:tcPr>
-          <w:p>
-            <w:r>
-              <w:rPr>
-                <w:sz w:val="16"/>
-              </w:rPr>
-              <w:t>10</w:t>
-            </w:r>
-          </w:p>
-        </w:tc>
-        <w:tc>
-          <w:tcPr>
-            <w:tcW w:type="dxa" w:w="4608"/>
-            <w:shd w:val="clear" w:color="auto" w:fill="f0f4ff"/>
-          </w:tcPr>
-          <w:p>
-            <w:r>
-              <w:rPr>
-                <w:sz w:val="16"/>
-              </w:rPr>
-              <w:t>Exportacao de historinhas e flashcards para PDF</w:t>
-            </w:r>
-          </w:p>
-        </w:tc>
-        <w:tc>
-          <w:tcPr>
-            <w:tcW w:type="dxa" w:w="864"/>
-            <w:shd w:val="clear" w:color="auto" w:fill="f0f4ff"/>
-          </w:tcPr>
-          <w:p>
-            <w:r>
-              <w:rPr>
-                <w:sz w:val="16"/>
-              </w:rPr>
-              <w:t>6h</w:t>
-            </w:r>
-          </w:p>
-        </w:tc>
-        <w:tc>
-          <w:tcPr>
-            <w:tcW w:type="dxa" w:w="4176"/>
-            <w:shd w:val="clear" w:color="auto" w:fill="f0f4ff"/>
-          </w:tcPr>
-          <w:p>
-            <w:r>
-              <w:rPr>
-                <w:sz w:val="15"/>
-              </w:rPr>
-              <w:t>window.print() + CSS de impressao ou jsPDF</w:t>
-            </w:r>
-          </w:p>
-        </w:tc>
-      </w:tr>
-      <w:tr>
-        <w:tc>
-          <w:tcPr>
-            <w:tcW w:type="dxa" w:w="360"/>
-          </w:tcPr>
-          <w:p>
-            <w:r>
-              <w:rPr>
-                <w:sz w:val="16"/>
-              </w:rPr>
-              <w:t>11</w:t>
-            </w:r>
-          </w:p>
-        </w:tc>
-        <w:tc>
-          <w:tcPr>
-            <w:tcW w:type="dxa" w:w="4608"/>
-          </w:tcPr>
-          <w:p>
-            <w:r>
-              <w:rPr>
-                <w:sz w:val="16"/>
-              </w:rPr>
-              <w:t>Estatisticas por materia e por periodo</w:t>
-            </w:r>
-          </w:p>
-        </w:tc>
-        <w:tc>
-          <w:tcPr>
-            <w:tcW w:type="dxa" w:w="864"/>
-          </w:tcPr>
-          <w:p>
-            <w:r>
-              <w:rPr>
-                <w:sz w:val="16"/>
-              </w:rPr>
-              <w:t>4h</w:t>
-            </w:r>
-          </w:p>
-        </w:tc>
-        <w:tc>
-          <w:tcPr>
-            <w:tcW w:type="dxa" w:w="4176"/>
-          </w:tcPr>
-          <w:p>
-            <w:r>
-              <w:rPr>
-                <w:sz w:val="15"/>
-              </w:rPr>
-              <w:t>Breakdown de acertos/erros por materia no simulado</w:t>
+              <w:t>Essencial para Economia (formulas em texto puro degradam o conteudo)</w:t>
             </w:r>
           </w:p>
         </w:tc>
@@ -878,10 +968,10 @@
       </w:pPr>
       <w:r>
         <w:rPr>
-          <w:color w:val="276E48"/>
-          <w:sz w:val="26"/>
+          <w:color w:val="E67E22"/>
+          <w:sz w:val="24"/>
         </w:rPr>
-        <w:t>TIER 3 - Novas features de valor  |  29h = 2 dias</w:t>
+        <w:t>FASE 3 - Retencao e produto completo  (roadmap pendente)  |  34h = 2,3 dias</w:t>
       </w:r>
     </w:p>
     <w:p>
@@ -890,7 +980,7 @@
           <w:i/>
           <w:sz w:val="16"/>
         </w:rPr>
-        <w:t>Diferenciam o produto; aumentam engajamento e conversao para premium.</w:t>
+        <w:t>Features que aumentam retorno diario e completam o que ja foi prometido.</w:t>
       </w:r>
     </w:p>
     <w:tbl>
@@ -900,15 +990,16 @@
         <w:tblLook w:firstColumn="1" w:firstRow="1" w:lastColumn="0" w:lastRow="0" w:noHBand="0" w:noVBand="1" w:val="04A0"/>
       </w:tblPr>
       <w:tblGrid>
-        <w:gridCol w:w="2340"/>
-        <w:gridCol w:w="2340"/>
-        <w:gridCol w:w="2340"/>
-        <w:gridCol w:w="2340"/>
+        <w:gridCol w:w="1872"/>
+        <w:gridCol w:w="1872"/>
+        <w:gridCol w:w="1872"/>
+        <w:gridCol w:w="1872"/>
+        <w:gridCol w:w="1872"/>
       </w:tblGrid>
       <w:tr>
         <w:tc>
           <w:tcPr>
-            <w:tcW w:type="dxa" w:w="360"/>
+            <w:tcW w:type="dxa" w:w="317"/>
             <w:shd w:val="clear" w:color="auto" w:fill="1a1a2e"/>
           </w:tcPr>
           <w:p>
@@ -927,7 +1018,7 @@
         </w:tc>
         <w:tc>
           <w:tcPr>
-            <w:tcW w:type="dxa" w:w="4608"/>
+            <w:tcW w:type="dxa" w:w="4176"/>
             <w:shd w:val="clear" w:color="auto" w:fill="1a1a2e"/>
           </w:tcPr>
           <w:p>
@@ -946,7 +1037,7 @@
         </w:tc>
         <w:tc>
           <w:tcPr>
-            <w:tcW w:type="dxa" w:w="864"/>
+            <w:tcW w:type="dxa" w:w="792"/>
             <w:shd w:val="clear" w:color="auto" w:fill="1a1a2e"/>
           </w:tcPr>
           <w:p>
@@ -965,7 +1056,26 @@
         </w:tc>
         <w:tc>
           <w:tcPr>
-            <w:tcW w:type="dxa" w:w="4176"/>
+            <w:tcW w:type="dxa" w:w="936"/>
+            <w:shd w:val="clear" w:color="auto" w:fill="1a1a2e"/>
+          </w:tcPr>
+          <w:p>
+            <w:pPr>
+              <w:jc w:val="center"/>
+            </w:pPr>
+            <w:r>
+              <w:rPr>
+                <w:b/>
+                <w:color w:val="FFFFFF"/>
+                <w:sz w:val="18"/>
+              </w:rPr>
+              <w:t>Status</w:t>
+            </w:r>
+          </w:p>
+        </w:tc>
+        <w:tc>
+          <w:tcPr>
+            <w:tcW w:type="dxa" w:w="3744"/>
             <w:shd w:val="clear" w:color="auto" w:fill="1a1a2e"/>
           </w:tcPr>
           <w:p>
@@ -986,7 +1096,146 @@
       <w:tr>
         <w:tc>
           <w:tcPr>
-            <w:tcW w:type="dxa" w:w="360"/>
+            <w:tcW w:type="dxa" w:w="317"/>
+            <w:shd w:val="clear" w:color="auto" w:fill="f0f4ff"/>
+          </w:tcPr>
+          <w:p>
+            <w:r>
+              <w:rPr>
+                <w:sz w:val="16"/>
+              </w:rPr>
+              <w:t>10</w:t>
+            </w:r>
+          </w:p>
+        </w:tc>
+        <w:tc>
+          <w:tcPr>
+            <w:tcW w:type="dxa" w:w="4176"/>
+            <w:shd w:val="clear" w:color="auto" w:fill="f0f4ff"/>
+          </w:tcPr>
+          <w:p>
+            <w:r>
+              <w:rPr>
+                <w:sz w:val="16"/>
+              </w:rPr>
+              <w:t>PWA: manifest.json + Service Worker offline</w:t>
+            </w:r>
+          </w:p>
+        </w:tc>
+        <w:tc>
+          <w:tcPr>
+            <w:tcW w:type="dxa" w:w="792"/>
+            <w:shd w:val="clear" w:color="auto" w:fill="f0f4ff"/>
+          </w:tcPr>
+          <w:p>
+            <w:r>
+              <w:rPr>
+                <w:sz w:val="16"/>
+              </w:rPr>
+              <w:t>6h</w:t>
+            </w:r>
+          </w:p>
+        </w:tc>
+        <w:tc>
+          <w:tcPr>
+            <w:tcW w:type="dxa" w:w="936"/>
+            <w:shd w:val="clear" w:color="auto" w:fill="f0f4ff"/>
+          </w:tcPr>
+          <w:p>
+            <w:r>
+              <w:rPr>
+                <w:sz w:val="16"/>
+              </w:rPr>
+              <w:t>pendente</w:t>
+            </w:r>
+          </w:p>
+        </w:tc>
+        <w:tc>
+          <w:tcPr>
+            <w:tcW w:type="dxa" w:w="3744"/>
+            <w:shd w:val="clear" w:color="auto" w:fill="f0f4ff"/>
+          </w:tcPr>
+          <w:p>
+            <w:r>
+              <w:rPr>
+                <w:sz w:val="15"/>
+              </w:rPr>
+              <w:t>Instalacao na tela inicial do celular; funciona offline real</w:t>
+            </w:r>
+          </w:p>
+        </w:tc>
+      </w:tr>
+      <w:tr>
+        <w:tc>
+          <w:tcPr>
+            <w:tcW w:type="dxa" w:w="317"/>
+          </w:tcPr>
+          <w:p>
+            <w:r>
+              <w:rPr>
+                <w:sz w:val="16"/>
+              </w:rPr>
+              <w:t>11</w:t>
+            </w:r>
+          </w:p>
+        </w:tc>
+        <w:tc>
+          <w:tcPr>
+            <w:tcW w:type="dxa" w:w="4176"/>
+          </w:tcPr>
+          <w:p>
+            <w:r>
+              <w:rPr>
+                <w:sz w:val="16"/>
+              </w:rPr>
+              <w:t>Push notifications para revisao SM-2</w:t>
+            </w:r>
+          </w:p>
+        </w:tc>
+        <w:tc>
+          <w:tcPr>
+            <w:tcW w:type="dxa" w:w="792"/>
+          </w:tcPr>
+          <w:p>
+            <w:r>
+              <w:rPr>
+                <w:sz w:val="16"/>
+              </w:rPr>
+              <w:t>8h</w:t>
+            </w:r>
+          </w:p>
+        </w:tc>
+        <w:tc>
+          <w:tcPr>
+            <w:tcW w:type="dxa" w:w="936"/>
+          </w:tcPr>
+          <w:p>
+            <w:r>
+              <w:rPr>
+                <w:sz w:val="16"/>
+              </w:rPr>
+              <w:t>pendente</w:t>
+            </w:r>
+          </w:p>
+        </w:tc>
+        <w:tc>
+          <w:tcPr>
+            <w:tcW w:type="dxa" w:w="3744"/>
+          </w:tcPr>
+          <w:p>
+            <w:r>
+              <w:rPr>
+                <w:sz w:val="15"/>
+              </w:rPr>
+              <w:t>Lembrete no dia correto; SM-2 perde metade do valor sem o alerta</w:t>
+            </w:r>
+          </w:p>
+        </w:tc>
+      </w:tr>
+      <w:tr>
+        <w:tc>
+          <w:tcPr>
+            <w:tcW w:type="dxa" w:w="317"/>
             <w:shd w:val="clear" w:color="auto" w:fill="f0f4ff"/>
           </w:tcPr>
           <w:p>
@@ -1000,7 +1249,7 @@
         </w:tc>
         <w:tc>
           <w:tcPr>
-            <w:tcW w:type="dxa" w:w="4608"/>
+            <w:tcW w:type="dxa" w:w="4176"/>
             <w:shd w:val="clear" w:color="auto" w:fill="f0f4ff"/>
           </w:tcPr>
           <w:p>
@@ -1008,13 +1257,13 @@
               <w:rPr>
                 <w:sz w:val="16"/>
               </w:rPr>
-              <w:t>Diagnostico de lacunas de conhecimento</w:t>
+              <w:t>Onboarding wizard para novos usuarios</w:t>
             </w:r>
           </w:p>
         </w:tc>
         <w:tc>
           <w:tcPr>
-            <w:tcW w:type="dxa" w:w="864"/>
+            <w:tcW w:type="dxa" w:w="792"/>
             <w:shd w:val="clear" w:color="auto" w:fill="f0f4ff"/>
           </w:tcPr>
           <w:p>
@@ -1022,13 +1271,27 @@
               <w:rPr>
                 <w:sz w:val="16"/>
               </w:rPr>
-              <w:t>8h</w:t>
+              <w:t>6h</w:t>
             </w:r>
           </w:p>
         </w:tc>
         <w:tc>
           <w:tcPr>
-            <w:tcW w:type="dxa" w:w="4176"/>
+            <w:tcW w:type="dxa" w:w="936"/>
+            <w:shd w:val="clear" w:color="auto" w:fill="f0f4ff"/>
+          </w:tcPr>
+          <w:p>
+            <w:r>
+              <w:rPr>
+                <w:sz w:val="16"/>
+              </w:rPr>
+              <w:t>pendente</w:t>
+            </w:r>
+          </w:p>
+        </w:tc>
+        <w:tc>
+          <w:tcPr>
+            <w:tcW w:type="dxa" w:w="3744"/>
             <w:shd w:val="clear" w:color="auto" w:fill="f0f4ff"/>
           </w:tcPr>
           <w:p>
@@ -1036,7 +1299,7 @@
               <w:rPr>
                 <w:sz w:val="15"/>
               </w:rPr>
-              <w:t>Identifica topicos com mais erros no simulado &gt; sugere historinha ou revisao SM-2</w:t>
+              <w:t>Wizard 3 passos: criar programa &gt; materia &gt; primeira historinha</w:t>
             </w:r>
           </w:p>
         </w:tc>
@@ -1044,7 +1307,7 @@
       <w:tr>
         <w:tc>
           <w:tcPr>
-            <w:tcW w:type="dxa" w:w="360"/>
+            <w:tcW w:type="dxa" w:w="317"/>
           </w:tcPr>
           <w:p>
             <w:r>
@@ -1057,40 +1320,53 @@
         </w:tc>
         <w:tc>
           <w:tcPr>
-            <w:tcW w:type="dxa" w:w="4608"/>
+            <w:tcW w:type="dxa" w:w="4176"/>
           </w:tcPr>
           <w:p>
             <w:r>
               <w:rPr>
                 <w:sz w:val="16"/>
               </w:rPr>
-              <w:t>Compartilhamento de programas de estudo</w:t>
+              <w:t>Historico de notas das redacoes com grafico</w:t>
             </w:r>
           </w:p>
         </w:tc>
         <w:tc>
           <w:tcPr>
-            <w:tcW w:type="dxa" w:w="864"/>
+            <w:tcW w:type="dxa" w:w="792"/>
           </w:tcPr>
           <w:p>
             <w:r>
               <w:rPr>
                 <w:sz w:val="16"/>
               </w:rPr>
-              <w:t>6h</w:t>
+              <w:t>4h</w:t>
             </w:r>
           </w:p>
         </w:tc>
         <w:tc>
           <w:tcPr>
-            <w:tcW w:type="dxa" w:w="4176"/>
+            <w:tcW w:type="dxa" w:w="936"/>
+          </w:tcPr>
+          <w:p>
+            <w:r>
+              <w:rPr>
+                <w:sz w:val="16"/>
+              </w:rPr>
+              <w:t>pendente</w:t>
+            </w:r>
+          </w:p>
+        </w:tc>
+        <w:tc>
+          <w:tcPr>
+            <w:tcW w:type="dxa" w:w="3744"/>
           </w:tcPr>
           <w:p>
             <w:r>
               <w:rPr>
                 <w:sz w:val="15"/>
               </w:rPr>
-              <w:t>Export/import de programa com materias e topicos (JSON)</w:t>
+              <w:t>Chart.js ja disponivel; salvar nota por redacao no Supabase</w:t>
             </w:r>
           </w:p>
         </w:tc>
@@ -1098,7 +1374,7 @@
       <w:tr>
         <w:tc>
           <w:tcPr>
-            <w:tcW w:type="dxa" w:w="360"/>
+            <w:tcW w:type="dxa" w:w="317"/>
             <w:shd w:val="clear" w:color="auto" w:fill="f0f4ff"/>
           </w:tcPr>
           <w:p>
@@ -1112,7 +1388,7 @@
         </w:tc>
         <w:tc>
           <w:tcPr>
-            <w:tcW w:type="dxa" w:w="4608"/>
+            <w:tcW w:type="dxa" w:w="4176"/>
             <w:shd w:val="clear" w:color="auto" w:fill="f0f4ff"/>
           </w:tcPr>
           <w:p>
@@ -1120,14 +1396,83 @@
               <w:rPr>
                 <w:sz w:val="16"/>
               </w:rPr>
-              <w:t>Estimativa de prontidao para a prova</w:t>
+              <w:t>Exportacao de historinhas e flashcards para PDF</w:t>
             </w:r>
           </w:p>
         </w:tc>
         <w:tc>
           <w:tcPr>
-            <w:tcW w:type="dxa" w:w="864"/>
+            <w:tcW w:type="dxa" w:w="792"/>
             <w:shd w:val="clear" w:color="auto" w:fill="f0f4ff"/>
+          </w:tcPr>
+          <w:p>
+            <w:r>
+              <w:rPr>
+                <w:sz w:val="16"/>
+              </w:rPr>
+              <w:t>6h</w:t>
+            </w:r>
+          </w:p>
+        </w:tc>
+        <w:tc>
+          <w:tcPr>
+            <w:tcW w:type="dxa" w:w="936"/>
+            <w:shd w:val="clear" w:color="auto" w:fill="f0f4ff"/>
+          </w:tcPr>
+          <w:p>
+            <w:r>
+              <w:rPr>
+                <w:sz w:val="16"/>
+              </w:rPr>
+              <w:t>pendente</w:t>
+            </w:r>
+          </w:p>
+        </w:tc>
+        <w:tc>
+          <w:tcPr>
+            <w:tcW w:type="dxa" w:w="3744"/>
+            <w:shd w:val="clear" w:color="auto" w:fill="f0f4ff"/>
+          </w:tcPr>
+          <w:p>
+            <w:r>
+              <w:rPr>
+                <w:sz w:val="15"/>
+              </w:rPr>
+              <w:t>window.print() + CSS de impressao ou jsPDF</w:t>
+            </w:r>
+          </w:p>
+        </w:tc>
+      </w:tr>
+      <w:tr>
+        <w:tc>
+          <w:tcPr>
+            <w:tcW w:type="dxa" w:w="317"/>
+          </w:tcPr>
+          <w:p>
+            <w:r>
+              <w:rPr>
+                <w:sz w:val="16"/>
+              </w:rPr>
+              <w:t>15</w:t>
+            </w:r>
+          </w:p>
+        </w:tc>
+        <w:tc>
+          <w:tcPr>
+            <w:tcW w:type="dxa" w:w="4176"/>
+          </w:tcPr>
+          <w:p>
+            <w:r>
+              <w:rPr>
+                <w:sz w:val="16"/>
+              </w:rPr>
+              <w:t>Estatisticas por materia e por periodo</w:t>
+            </w:r>
+          </w:p>
+        </w:tc>
+        <w:tc>
+          <w:tcPr>
+            <w:tcW w:type="dxa" w:w="792"/>
           </w:tcPr>
           <w:p>
             <w:r>
@@ -1140,127 +1485,27 @@
         </w:tc>
         <w:tc>
           <w:tcPr>
-            <w:tcW w:type="dxa" w:w="4176"/>
-            <w:shd w:val="clear" w:color="auto" w:fill="f0f4ff"/>
+            <w:tcW w:type="dxa" w:w="936"/>
+          </w:tcPr>
+          <w:p>
+            <w:r>
+              <w:rPr>
+                <w:sz w:val="16"/>
+              </w:rPr>
+              <w:t>pendente</w:t>
+            </w:r>
+          </w:p>
+        </w:tc>
+        <w:tc>
+          <w:tcPr>
+            <w:tcW w:type="dxa" w:w="3744"/>
           </w:tcPr>
           <w:p>
             <w:r>
               <w:rPr>
                 <w:sz w:val="15"/>
               </w:rPr>
-              <w:t>"Com seu ritmo atual, cobrira X% do conteudo ate a data da prova"</w:t>
-            </w:r>
-          </w:p>
-        </w:tc>
-      </w:tr>
-      <w:tr>
-        <w:tc>
-          <w:tcPr>
-            <w:tcW w:type="dxa" w:w="360"/>
-          </w:tcPr>
-          <w:p>
-            <w:r>
-              <w:rPr>
-                <w:sz w:val="16"/>
-              </w:rPr>
-              <w:t>15</w:t>
-            </w:r>
-          </w:p>
-        </w:tc>
-        <w:tc>
-          <w:tcPr>
-            <w:tcW w:type="dxa" w:w="4608"/>
-          </w:tcPr>
-          <w:p>
-            <w:r>
-              <w:rPr>
-                <w:sz w:val="16"/>
-              </w:rPr>
-              <w:t>Suporte a LaTeX/MathJax nas respostas</w:t>
-            </w:r>
-          </w:p>
-        </w:tc>
-        <w:tc>
-          <w:tcPr>
-            <w:tcW w:type="dxa" w:w="864"/>
-          </w:tcPr>
-          <w:p>
-            <w:r>
-              <w:rPr>
-                <w:sz w:val="16"/>
-              </w:rPr>
-              <w:t>3h</w:t>
-            </w:r>
-          </w:p>
-        </w:tc>
-        <w:tc>
-          <w:tcPr>
-            <w:tcW w:type="dxa" w:w="4176"/>
-          </w:tcPr>
-          <w:p>
-            <w:r>
-              <w:rPr>
-                <w:sz w:val="15"/>
-              </w:rPr>
-              <w:t>Essencial para Economia (formulas em texto puro degradam o conteudo)</w:t>
-            </w:r>
-          </w:p>
-        </w:tc>
-      </w:tr>
-      <w:tr>
-        <w:tc>
-          <w:tcPr>
-            <w:tcW w:type="dxa" w:w="360"/>
-            <w:shd w:val="clear" w:color="auto" w:fill="f0f4ff"/>
-          </w:tcPr>
-          <w:p>
-            <w:r>
-              <w:rPr>
-                <w:sz w:val="16"/>
-              </w:rPr>
-              <w:t>16</w:t>
-            </w:r>
-          </w:p>
-        </w:tc>
-        <w:tc>
-          <w:tcPr>
-            <w:tcW w:type="dxa" w:w="4608"/>
-            <w:shd w:val="clear" w:color="auto" w:fill="f0f4ff"/>
-          </w:tcPr>
-          <w:p>
-            <w:r>
-              <w:rPr>
-                <w:sz w:val="16"/>
-              </w:rPr>
-              <w:t>Testes automatizados basicos (assertions no console)</w:t>
-            </w:r>
-          </w:p>
-        </w:tc>
-        <w:tc>
-          <w:tcPr>
-            <w:tcW w:type="dxa" w:w="864"/>
-            <w:shd w:val="clear" w:color="auto" w:fill="f0f4ff"/>
-          </w:tcPr>
-          <w:p>
-            <w:r>
-              <w:rPr>
-                <w:sz w:val="16"/>
-              </w:rPr>
-              <w:t>8h</w:t>
-            </w:r>
-          </w:p>
-        </w:tc>
-        <w:tc>
-          <w:tcPr>
-            <w:tcW w:type="dxa" w:w="4176"/>
-            <w:shd w:val="clear" w:color="auto" w:fill="f0f4ff"/>
-          </w:tcPr>
-          <w:p>
-            <w:r>
-              <w:rPr>
-                <w:sz w:val="15"/>
-              </w:rPr>
-              <w:t>Arquivo tests.js separado com smoke tests; 4313 linhas sem teste e risco alto</w:t>
+              <w:t>Breakdown de acertos/erros por materia no simulado</w:t>
             </w:r>
           </w:p>
         </w:tc>
@@ -1273,10 +1518,19 @@
       </w:pPr>
       <w:r>
         <w:rPr>
-          <w:color w:val="555555"/>
-          <w:sz w:val="26"/>
+          <w:color w:val="C0392B"/>
+          <w:sz w:val="24"/>
         </w:rPr>
-        <w:t>TECH DEBT - Documentacao e qualidade  |  3h</w:t>
+        <w:t>FASE 4 - Monetizacao  (cobrar por um produto que ja entrega valor)  |  28h = 1,9 dias</w:t>
+      </w:r>
+    </w:p>
+    <w:p>
+      <w:r>
+        <w:rPr>
+          <w:i/>
+          <w:sz w:val="16"/>
+        </w:rPr>
+        <w:t>So faz sentido cobrar depois que o produto estiver solido e com usuarios engajados.</w:t>
       </w:r>
     </w:p>
     <w:tbl>
@@ -1286,15 +1540,16 @@
         <w:tblLook w:firstColumn="1" w:firstRow="1" w:lastColumn="0" w:lastRow="0" w:noHBand="0" w:noVBand="1" w:val="04A0"/>
       </w:tblPr>
       <w:tblGrid>
-        <w:gridCol w:w="2340"/>
-        <w:gridCol w:w="2340"/>
-        <w:gridCol w:w="2340"/>
-        <w:gridCol w:w="2340"/>
+        <w:gridCol w:w="1872"/>
+        <w:gridCol w:w="1872"/>
+        <w:gridCol w:w="1872"/>
+        <w:gridCol w:w="1872"/>
+        <w:gridCol w:w="1872"/>
       </w:tblGrid>
       <w:tr>
         <w:tc>
           <w:tcPr>
-            <w:tcW w:type="dxa" w:w="360"/>
+            <w:tcW w:type="dxa" w:w="317"/>
             <w:shd w:val="clear" w:color="auto" w:fill="1a1a2e"/>
           </w:tcPr>
           <w:p>
@@ -1313,7 +1568,7 @@
         </w:tc>
         <w:tc>
           <w:tcPr>
-            <w:tcW w:type="dxa" w:w="4608"/>
+            <w:tcW w:type="dxa" w:w="4176"/>
             <w:shd w:val="clear" w:color="auto" w:fill="1a1a2e"/>
           </w:tcPr>
           <w:p>
@@ -1332,7 +1587,7 @@
         </w:tc>
         <w:tc>
           <w:tcPr>
-            <w:tcW w:type="dxa" w:w="864"/>
+            <w:tcW w:type="dxa" w:w="792"/>
             <w:shd w:val="clear" w:color="auto" w:fill="1a1a2e"/>
           </w:tcPr>
           <w:p>
@@ -1351,7 +1606,26 @@
         </w:tc>
         <w:tc>
           <w:tcPr>
-            <w:tcW w:type="dxa" w:w="4176"/>
+            <w:tcW w:type="dxa" w:w="936"/>
+            <w:shd w:val="clear" w:color="auto" w:fill="1a1a2e"/>
+          </w:tcPr>
+          <w:p>
+            <w:pPr>
+              <w:jc w:val="center"/>
+            </w:pPr>
+            <w:r>
+              <w:rPr>
+                <w:b/>
+                <w:color w:val="FFFFFF"/>
+                <w:sz w:val="18"/>
+              </w:rPr>
+              <w:t>Status</w:t>
+            </w:r>
+          </w:p>
+        </w:tc>
+        <w:tc>
+          <w:tcPr>
+            <w:tcW w:type="dxa" w:w="3744"/>
             <w:shd w:val="clear" w:color="auto" w:fill="1a1a2e"/>
           </w:tcPr>
           <w:p>
@@ -1372,8 +1646,79 @@
       <w:tr>
         <w:tc>
           <w:tcPr>
-            <w:tcW w:type="dxa" w:w="360"/>
+            <w:tcW w:type="dxa" w:w="317"/>
             <w:shd w:val="clear" w:color="auto" w:fill="f0f4ff"/>
+          </w:tcPr>
+          <w:p>
+            <w:r>
+              <w:rPr>
+                <w:sz w:val="16"/>
+              </w:rPr>
+              <w:t>16</w:t>
+            </w:r>
+          </w:p>
+        </w:tc>
+        <w:tc>
+          <w:tcPr>
+            <w:tcW w:type="dxa" w:w="4176"/>
+            <w:shd w:val="clear" w:color="auto" w:fill="f0f4ff"/>
+          </w:tcPr>
+          <w:p>
+            <w:r>
+              <w:rPr>
+                <w:sz w:val="16"/>
+              </w:rPr>
+              <w:t>Integracao Stripe real (substituir ativarPremiumDemo())</w:t>
+            </w:r>
+          </w:p>
+        </w:tc>
+        <w:tc>
+          <w:tcPr>
+            <w:tcW w:type="dxa" w:w="792"/>
+            <w:shd w:val="clear" w:color="auto" w:fill="f0f4ff"/>
+          </w:tcPr>
+          <w:p>
+            <w:r>
+              <w:rPr>
+                <w:sz w:val="16"/>
+              </w:rPr>
+              <w:t>16h</w:t>
+            </w:r>
+          </w:p>
+        </w:tc>
+        <w:tc>
+          <w:tcPr>
+            <w:tcW w:type="dxa" w:w="936"/>
+            <w:shd w:val="clear" w:color="auto" w:fill="f0f4ff"/>
+          </w:tcPr>
+          <w:p>
+            <w:r>
+              <w:rPr>
+                <w:sz w:val="16"/>
+              </w:rPr>
+              <w:t>pendente</w:t>
+            </w:r>
+          </w:p>
+        </w:tc>
+        <w:tc>
+          <w:tcPr>
+            <w:tcW w:type="dxa" w:w="3744"/>
+            <w:shd w:val="clear" w:color="auto" w:fill="f0f4ff"/>
+          </w:tcPr>
+          <w:p>
+            <w:r>
+              <w:rPr>
+                <w:sz w:val="15"/>
+              </w:rPr>
+              <w:t>Checkout session, webhook, atualizacao de plano no Supabase</w:t>
+            </w:r>
+          </w:p>
+        </w:tc>
+      </w:tr>
+      <w:tr>
+        <w:tc>
+          <w:tcPr>
+            <w:tcW w:type="dxa" w:w="317"/>
           </w:tcPr>
           <w:p>
             <w:r>
@@ -1386,43 +1731,53 @@
         </w:tc>
         <w:tc>
           <w:tcPr>
-            <w:tcW w:type="dxa" w:w="4608"/>
-            <w:shd w:val="clear" w:color="auto" w:fill="f0f4ff"/>
+            <w:tcW w:type="dxa" w:w="4176"/>
           </w:tcPr>
           <w:p>
             <w:r>
               <w:rPr>
                 <w:sz w:val="16"/>
               </w:rPr>
-              <w:t>Atualizar README.md (v1.4 + freemium + multiplos programas)</w:t>
+              <w:t>Proxy API via Supabase Edge Function</w:t>
             </w:r>
           </w:p>
         </w:tc>
         <w:tc>
           <w:tcPr>
-            <w:tcW w:type="dxa" w:w="864"/>
-            <w:shd w:val="clear" w:color="auto" w:fill="f0f4ff"/>
+            <w:tcW w:type="dxa" w:w="792"/>
           </w:tcPr>
           <w:p>
             <w:r>
               <w:rPr>
                 <w:sz w:val="16"/>
               </w:rPr>
-              <w:t>1h</w:t>
+              <w:t>8h</w:t>
             </w:r>
           </w:p>
         </w:tc>
         <w:tc>
           <w:tcPr>
-            <w:tcW w:type="dxa" w:w="4176"/>
-            <w:shd w:val="clear" w:color="auto" w:fill="f0f4ff"/>
+            <w:tcW w:type="dxa" w:w="936"/>
+          </w:tcPr>
+          <w:p>
+            <w:r>
+              <w:rPr>
+                <w:sz w:val="16"/>
+              </w:rPr>
+              <w:t>pendente</w:t>
+            </w:r>
+          </w:p>
+        </w:tc>
+        <w:tc>
+          <w:tcPr>
+            <w:tcW w:type="dxa" w:w="3744"/>
           </w:tcPr>
           <w:p>
             <w:r>
               <w:rPr>
                 <w:sz w:val="15"/>
               </w:rPr>
-              <w:t>README ainda descreve v1.1/v1.2; SM-2 listado como pendente mas ja feito</w:t>
+              <w:t>Plataforma chama Anthropic com chave propria; fim da dependencia da chave do usuario</w:t>
             </w:r>
           </w:p>
         </w:tc>
@@ -1430,7 +1785,8 @@
       <w:tr>
         <w:tc>
           <w:tcPr>
-            <w:tcW w:type="dxa" w:w="360"/>
+            <w:tcW w:type="dxa" w:w="317"/>
+            <w:shd w:val="clear" w:color="auto" w:fill="f0f4ff"/>
           </w:tcPr>
           <w:p>
             <w:r>
@@ -1443,40 +1799,57 @@
         </w:tc>
         <w:tc>
           <w:tcPr>
-            <w:tcW w:type="dxa" w:w="4608"/>
+            <w:tcW w:type="dxa" w:w="4176"/>
+            <w:shd w:val="clear" w:color="auto" w:fill="f0f4ff"/>
           </w:tcPr>
           <w:p>
             <w:r>
               <w:rPr>
                 <w:sz w:val="16"/>
               </w:rPr>
-              <w:t>Otimizar max_tokens por tipo de chamada a API</w:t>
+              <w:t>Rate limiting real no backend (Supabase)</w:t>
             </w:r>
           </w:p>
         </w:tc>
         <w:tc>
           <w:tcPr>
-            <w:tcW w:type="dxa" w:w="864"/>
+            <w:tcW w:type="dxa" w:w="792"/>
+            <w:shd w:val="clear" w:color="auto" w:fill="f0f4ff"/>
           </w:tcPr>
           <w:p>
             <w:r>
               <w:rPr>
                 <w:sz w:val="16"/>
               </w:rPr>
-              <w:t>2h</w:t>
+              <w:t>4h</w:t>
             </w:r>
           </w:p>
         </w:tc>
         <w:tc>
           <w:tcPr>
-            <w:tcW w:type="dxa" w:w="4176"/>
+            <w:tcW w:type="dxa" w:w="936"/>
+            <w:shd w:val="clear" w:color="auto" w:fill="f0f4ff"/>
+          </w:tcPr>
+          <w:p>
+            <w:r>
+              <w:rPr>
+                <w:sz w:val="16"/>
+              </w:rPr>
+              <w:t>pendente</w:t>
+            </w:r>
+          </w:p>
+        </w:tc>
+        <w:tc>
+          <w:tcPr>
+            <w:tcW w:type="dxa" w:w="3744"/>
+            <w:shd w:val="clear" w:color="auto" w:fill="f0f4ff"/>
           </w:tcPr>
           <w:p>
             <w:r>
               <w:rPr>
                 <w:sz w:val="15"/>
               </w:rPr>
-              <w:t>callClaude() usa 1200 fixo; plano de estudos precisa 3000; historinha 800</w:t>
+              <w:t>Contador de geracoes via RLS/trigger - nao so frontend; impede burla via console</w:t>
             </w:r>
           </w:p>
         </w:tc>
@@ -1518,7 +1891,7 @@
                 <w:color w:val="FFFFFF"/>
                 <w:sz w:val="18"/>
               </w:rPr>
-              <w:t>Tier</w:t>
+              <w:t>Fase</w:t>
             </w:r>
           </w:p>
         </w:tc>
@@ -1537,7 +1910,7 @@
                 <w:color w:val="FFFFFF"/>
                 <w:sz w:val="18"/>
               </w:rPr>
-              <w:t>Horas</w:t>
+              <w:t>Horas restantes</w:t>
             </w:r>
           </w:p>
         </w:tc>
@@ -1572,7 +1945,7 @@
               <w:rPr>
                 <w:sz w:val="16"/>
               </w:rPr>
-              <w:t>Tier 1 - Critico</w:t>
+              <w:t>Fase 1 - Fundacao</w:t>
             </w:r>
           </w:p>
         </w:tc>
@@ -1586,7 +1959,7 @@
               <w:rPr>
                 <w:sz w:val="16"/>
               </w:rPr>
-              <w:t>30h</w:t>
+              <w:t>10h</w:t>
             </w:r>
           </w:p>
         </w:tc>
@@ -1600,7 +1973,7 @@
               <w:rPr>
                 <w:sz w:val="15"/>
               </w:rPr>
-              <w:t>2,0 dias</w:t>
+              <w:t>0,7 dias</w:t>
             </w:r>
           </w:p>
         </w:tc>
@@ -1615,13 +1988,56 @@
               <w:rPr>
                 <w:sz w:val="16"/>
               </w:rPr>
-              <w:t>Tier 2 - Roadmap pendente</w:t>
+              <w:t>Fase 2 - Features diferenciadoras</w:t>
             </w:r>
           </w:p>
         </w:tc>
         <w:tc>
           <w:tcPr>
             <w:tcW w:type="dxa" w:w="2160"/>
+          </w:tcPr>
+          <w:p>
+            <w:r>
+              <w:rPr>
+                <w:sz w:val="16"/>
+              </w:rPr>
+              <w:t>21h</w:t>
+            </w:r>
+          </w:p>
+        </w:tc>
+        <w:tc>
+          <w:tcPr>
+            <w:tcW w:type="dxa" w:w="2880"/>
+          </w:tcPr>
+          <w:p>
+            <w:r>
+              <w:rPr>
+                <w:sz w:val="15"/>
+              </w:rPr>
+              <w:t>1,4 dias</w:t>
+            </w:r>
+          </w:p>
+        </w:tc>
+      </w:tr>
+      <w:tr>
+        <w:tc>
+          <w:tcPr>
+            <w:tcW w:type="dxa" w:w="5040"/>
+            <w:shd w:val="clear" w:color="auto" w:fill="f0f4ff"/>
+          </w:tcPr>
+          <w:p>
+            <w:r>
+              <w:rPr>
+                <w:sz w:val="16"/>
+              </w:rPr>
+              <w:t>Fase 3 - Retencao e produto completo</w:t>
+            </w:r>
+          </w:p>
+        </w:tc>
+        <w:tc>
+          <w:tcPr>
+            <w:tcW w:type="dxa" w:w="2160"/>
+            <w:shd w:val="clear" w:color="auto" w:fill="f0f4ff"/>
           </w:tcPr>
           <w:p>
             <w:r>
@@ -1635,6 +2051,7 @@
         <w:tc>
           <w:tcPr>
             <w:tcW w:type="dxa" w:w="2880"/>
+            <w:shd w:val="clear" w:color="auto" w:fill="f0f4ff"/>
           </w:tcPr>
           <w:p>
             <w:r>
@@ -1650,35 +2067,32 @@
         <w:tc>
           <w:tcPr>
             <w:tcW w:type="dxa" w:w="5040"/>
-            <w:shd w:val="clear" w:color="auto" w:fill="f0f4ff"/>
           </w:tcPr>
           <w:p>
             <w:r>
               <w:rPr>
                 <w:sz w:val="16"/>
               </w:rPr>
-              <w:t>Tier 3 - Novas features</w:t>
+              <w:t>Fase 4 - Monetizacao</w:t>
             </w:r>
           </w:p>
         </w:tc>
         <w:tc>
           <w:tcPr>
             <w:tcW w:type="dxa" w:w="2160"/>
-            <w:shd w:val="clear" w:color="auto" w:fill="f0f4ff"/>
           </w:tcPr>
           <w:p>
             <w:r>
               <w:rPr>
                 <w:sz w:val="16"/>
               </w:rPr>
-              <w:t>29h</w:t>
+              <w:t>28h</w:t>
             </w:r>
           </w:p>
         </w:tc>
         <w:tc>
           <w:tcPr>
             <w:tcW w:type="dxa" w:w="2880"/>
-            <w:shd w:val="clear" w:color="auto" w:fill="f0f4ff"/>
           </w:tcPr>
           <w:p>
             <w:r>
@@ -1694,47 +2108,6 @@
         <w:tc>
           <w:tcPr>
             <w:tcW w:type="dxa" w:w="5040"/>
-          </w:tcPr>
-          <w:p>
-            <w:r>
-              <w:rPr>
-                <w:sz w:val="16"/>
-              </w:rPr>
-              <w:t>Tech Debt</w:t>
-            </w:r>
-          </w:p>
-        </w:tc>
-        <w:tc>
-          <w:tcPr>
-            <w:tcW w:type="dxa" w:w="2160"/>
-          </w:tcPr>
-          <w:p>
-            <w:r>
-              <w:rPr>
-                <w:sz w:val="16"/>
-              </w:rPr>
-              <w:t>3h</w:t>
-            </w:r>
-          </w:p>
-        </w:tc>
-        <w:tc>
-          <w:tcPr>
-            <w:tcW w:type="dxa" w:w="2880"/>
-          </w:tcPr>
-          <w:p>
-            <w:r>
-              <w:rPr>
-                <w:sz w:val="15"/>
-              </w:rPr>
-              <w:t>0,2 dias</w:t>
-            </w:r>
-          </w:p>
-        </w:tc>
-      </w:tr>
-      <w:tr>
-        <w:tc>
-          <w:tcPr>
-            <w:tcW w:type="dxa" w:w="5040"/>
             <w:shd w:val="clear" w:color="auto" w:fill="f0f4ff"/>
           </w:tcPr>
           <w:p>
@@ -1742,7 +2115,7 @@
               <w:rPr>
                 <w:sz w:val="16"/>
               </w:rPr>
-              <w:t>TOTAL</w:t>
+              <w:t>TOTAL RESTANTE</w:t>
             </w:r>
           </w:p>
         </w:tc>
@@ -1756,7 +2129,7 @@
               <w:rPr>
                 <w:sz w:val="16"/>
               </w:rPr>
-              <w:t>96h</w:t>
+              <w:t>93h</w:t>
             </w:r>
           </w:p>
         </w:tc>
@@ -1770,7 +2143,7 @@
               <w:rPr>
                 <w:sz w:val="15"/>
               </w:rPr>
-              <w:t>~6,5 dias</w:t>
+              <w:t>~6,2 dias</w:t>
             </w:r>
           </w:p>
         </w:tc>
@@ -1782,52 +2155,73 @@
         <w:pStyle w:val="Heading2"/>
       </w:pPr>
       <w:r>
-        <w:t>Ordem Recomendada de Execucao</w:t>
+        <w:t>Regra de execucao de cada item</w:t>
       </w:r>
     </w:p>
     <w:p>
-      <w:r>
-        <w:rPr>
-          <w:b/>
-          <w:sz w:val="18"/>
-        </w:rPr>
-        <w:t xml:space="preserve">Semana 1 - Dias 1-2:  </w:t>
-      </w:r>
+      <w:pPr>
+        <w:pStyle w:val="ListBullet"/>
+      </w:pPr>
       <w:r>
         <w:rPr>
           <w:sz w:val="18"/>
         </w:rPr>
-        <w:t>Items 1, 2, 17, 18 (bugs + tech debt) | Items 3, 4, 5 (monetizacao real)</w:t>
+        <w:t>1.  git checkout -b &lt;tipo&gt;/&lt;descricao-curta&gt;</w:t>
       </w:r>
     </w:p>
     <w:p>
-      <w:r>
-        <w:rPr>
-          <w:b/>
-          <w:sz w:val="18"/>
-        </w:rPr>
-        <w:t xml:space="preserve">Semana 2 - Dias 3-4:  </w:t>
-      </w:r>
+      <w:pPr>
+        <w:pStyle w:val="ListBullet"/>
+      </w:pPr>
       <w:r>
         <w:rPr>
           <w:sz w:val="18"/>
         </w:rPr>
-        <w:t>Items 6, 7, 8 (retencao mobile + onboarding) | Items 9, 10, 11 (roadmap pendente)</w:t>
+        <w:t>2.  Implementar</w:t>
       </w:r>
     </w:p>
     <w:p>
-      <w:r>
-        <w:rPr>
-          <w:b/>
-          <w:sz w:val="18"/>
-        </w:rPr>
-        <w:t xml:space="preserve">Semana 3 - Dias 5-7:  </w:t>
-      </w:r>
+      <w:pPr>
+        <w:pStyle w:val="ListBullet"/>
+      </w:pPr>
       <w:r>
         <w:rPr>
           <w:sz w:val="18"/>
         </w:rPr>
-        <w:t>Items 12, 13, 14 (features diferenciadores) | Items 15, 16 (qualidade)</w:t>
+        <w:t>3.  Atualizar README.md com a melhoria/correcao</w:t>
+      </w:r>
+    </w:p>
+    <w:p>
+      <w:pPr>
+        <w:pStyle w:val="ListBullet"/>
+      </w:pPr>
+      <w:r>
+        <w:rPr>
+          <w:sz w:val="18"/>
+        </w:rPr>
+        <w:t>4.  git commit -m "tipo: descricao"</w:t>
+      </w:r>
+    </w:p>
+    <w:p>
+      <w:pPr>
+        <w:pStyle w:val="ListBullet"/>
+      </w:pPr>
+      <w:r>
+        <w:rPr>
+          <w:sz w:val="18"/>
+        </w:rPr>
+        <w:t>5.  git checkout main &amp;&amp; git merge &lt;branch&gt;</w:t>
+      </w:r>
+    </w:p>
+    <w:p>
+      <w:pPr>
+        <w:pStyle w:val="ListBullet"/>
+      </w:pPr>
+      <w:r>
+        <w:rPr>
+          <w:sz w:val="18"/>
+        </w:rPr>
+        <w:t>6.  git push origin main</w:t>
       </w:r>
     </w:p>
     <w:p/>
@@ -1838,7 +2232,7 @@
           <w:color w:val="AAAAAA"/>
           <w:sz w:val="15"/>
         </w:rPr>
-        <w:t>Gerado automaticamente pela analise do projeto em 22/05/2026.</w:t>
+        <w:t>Atualizado em 22/05/2026 - estrategia invertida: valor antes de monetizacao.</w:t>
       </w:r>
     </w:p>
     <w:sectPr>

</xml_diff>